<commit_message>
Update package dependencies and enhance UI components: Add dotenv package for environment variable management, introduce a new "Maps" tab in the dashboard layout, and improve asset management features in various components. Refactor asset editing and detail display logic for better user experience and maintainability.
</commit_message>
<xml_diff>
--- a/assets/Sheets/Equipment hire lease disclaimer.docx
+++ b/assets/Sheets/Equipment hire lease disclaimer.docx
@@ -609,7 +609,15 @@
                 <w:bCs/>
                 <w:sz w:val="20"/>
               </w:rPr>
-              <w:t>$[cost] per day</w:t>
+              <w:t xml:space="preserve">$[cost] </w:t>
+            </w:r>
+            <w:r>
+              <w:rPr>
+                <w:b/>
+                <w:bCs/>
+                <w:sz w:val="20"/>
+              </w:rPr>
+              <w:t>[duration]</w:t>
             </w:r>
           </w:p>
         </w:tc>
@@ -973,15 +981,7 @@
         <w:spacing w:after="120"/>
       </w:pPr>
       <w:r>
-        <w:t>This contract is accepted by Engineering Surveys on [</w:t>
-      </w:r>
-      <w:proofErr w:type="spellStart"/>
-      <w:r>
-        <w:t>todaysdate</w:t>
-      </w:r>
-      <w:proofErr w:type="spellEnd"/>
-      <w:r>
-        <w:t>].</w:t>
+        <w:t>This contract is accepted by Engineering Surveys on [todaysdate].</w:t>
       </w:r>
     </w:p>
     <w:tbl>
@@ -1182,20 +1182,7 @@
               <w:jc w:val="center"/>
             </w:pPr>
             <w:r>
-              <w:t>/</w:t>
-            </w:r>
-            <w:proofErr w:type="spellStart"/>
-            <w:proofErr w:type="gramStart"/>
-            <w:r>
-              <w:t>sign</w:t>
-            </w:r>
-            <w:proofErr w:type="gramEnd"/>
-            <w:r>
-              <w:t>_lease</w:t>
-            </w:r>
-            <w:proofErr w:type="spellEnd"/>
-            <w:r>
-              <w:t>/</w:t>
+              <w:t>/sign_lease/</w:t>
             </w:r>
           </w:p>
         </w:tc>
@@ -1306,25 +1293,7 @@
                 <w:bCs/>
                 <w:sz w:val="20"/>
               </w:rPr>
-              <w:t>[</w:t>
-            </w:r>
-            <w:proofErr w:type="spellStart"/>
-            <w:r>
-              <w:rPr>
-                <w:b/>
-                <w:bCs/>
-                <w:sz w:val="20"/>
-              </w:rPr>
-              <w:t>companyEntity</w:t>
-            </w:r>
-            <w:proofErr w:type="spellEnd"/>
-            <w:r>
-              <w:rPr>
-                <w:b/>
-                <w:bCs/>
-                <w:sz w:val="20"/>
-              </w:rPr>
-              <w:t>]</w:t>
+              <w:t>[companyEntity]</w:t>
             </w:r>
             <w:r>
               <w:rPr>
@@ -1504,25 +1473,7 @@
                 <w:bCs/>
                 <w:sz w:val="20"/>
               </w:rPr>
-              <w:t>[</w:t>
-            </w:r>
-            <w:proofErr w:type="spellStart"/>
-            <w:r>
-              <w:rPr>
-                <w:b/>
-                <w:bCs/>
-                <w:sz w:val="20"/>
-              </w:rPr>
-              <w:t>todaysdate</w:t>
-            </w:r>
-            <w:proofErr w:type="spellEnd"/>
-            <w:r>
-              <w:rPr>
-                <w:b/>
-                <w:bCs/>
-                <w:sz w:val="20"/>
-              </w:rPr>
-              <w:t>]</w:t>
+              <w:t>[todaysdate]</w:t>
             </w:r>
           </w:p>
         </w:tc>
@@ -1778,21 +1729,7 @@
         <w:rPr>
           <w:sz w:val="19"/>
         </w:rPr>
-        <w:t xml:space="preserve">The renter must pay to the owner any total cost of recovery, cleaning, repair, or damage arising from </w:t>
-      </w:r>
-      <w:proofErr w:type="spellStart"/>
-      <w:r>
-        <w:rPr>
-          <w:sz w:val="19"/>
-        </w:rPr>
-        <w:t>wilful</w:t>
-      </w:r>
-      <w:proofErr w:type="spellEnd"/>
-      <w:r>
-        <w:rPr>
-          <w:sz w:val="19"/>
-        </w:rPr>
-        <w:t xml:space="preserve"> misuse of the equipment.</w:t>
+        <w:t>The renter must pay to the owner any total cost of recovery, cleaning, repair, or damage arising from wilful misuse of the equipment.</w:t>
       </w:r>
     </w:p>
     <w:p>
@@ -2089,23 +2026,7 @@
               <w:color w:val="6B7280"/>
               <w:sz w:val="17"/>
             </w:rPr>
-            <w:t xml:space="preserve">Engineering </w:t>
-          </w:r>
-          <w:proofErr w:type="gramStart"/>
-          <w:r>
-            <w:rPr>
-              <w:color w:val="6B7280"/>
-              <w:sz w:val="17"/>
-            </w:rPr>
-            <w:t>Surveys  |</w:t>
-          </w:r>
-          <w:proofErr w:type="gramEnd"/>
-          <w:r>
-            <w:rPr>
-              <w:color w:val="6B7280"/>
-              <w:sz w:val="17"/>
-            </w:rPr>
-            <w:t xml:space="preserve">  Equipment Lease Agreement</w:t>
+            <w:t>Engineering Surveys  |  Equipment Lease Agreement</w:t>
           </w:r>
         </w:p>
       </w:tc>
@@ -2211,23 +2132,7 @@
               <w:color w:val="6B7280"/>
               <w:sz w:val="17"/>
             </w:rPr>
-            <w:t xml:space="preserve">Engineering </w:t>
-          </w:r>
-          <w:proofErr w:type="gramStart"/>
-          <w:r>
-            <w:rPr>
-              <w:color w:val="6B7280"/>
-              <w:sz w:val="17"/>
-            </w:rPr>
-            <w:t>Surveys  |</w:t>
-          </w:r>
-          <w:proofErr w:type="gramEnd"/>
-          <w:r>
-            <w:rPr>
-              <w:color w:val="6B7280"/>
-              <w:sz w:val="17"/>
-            </w:rPr>
-            <w:t xml:space="preserve">  Equipment Lease Agreement</w:t>
+            <w:t>Engineering Surveys  |  Equipment Lease Agreement</w:t>
           </w:r>
         </w:p>
       </w:tc>
@@ -2457,35 +2362,7 @@
             <w:rPr>
               <w:sz w:val="17"/>
             </w:rPr>
-            <w:t xml:space="preserve">T: (08) 8340 </w:t>
-          </w:r>
-          <w:proofErr w:type="gramStart"/>
-          <w:r>
-            <w:rPr>
-              <w:sz w:val="17"/>
-            </w:rPr>
-            <w:t>4469  |</w:t>
-          </w:r>
-          <w:proofErr w:type="gramEnd"/>
-          <w:r>
-            <w:rPr>
-              <w:sz w:val="17"/>
-            </w:rPr>
-            <w:t xml:space="preserve">  M: 0411 744 </w:t>
-          </w:r>
-          <w:proofErr w:type="gramStart"/>
-          <w:r>
-            <w:rPr>
-              <w:sz w:val="17"/>
-            </w:rPr>
-            <w:t>095  |</w:t>
-          </w:r>
-          <w:proofErr w:type="gramEnd"/>
-          <w:r>
-            <w:rPr>
-              <w:sz w:val="17"/>
-            </w:rPr>
-            <w:t xml:space="preserve">  F: (08) 8340 4470</w:t>
+            <w:t>T: (08) 8340 4469  |  M: 0411 744 095  |  F: (08) 8340 4470</w:t>
           </w:r>
         </w:p>
         <w:p>
@@ -2496,21 +2373,7 @@
             <w:rPr>
               <w:sz w:val="17"/>
             </w:rPr>
-            <w:t xml:space="preserve">E: </w:t>
-          </w:r>
-          <w:proofErr w:type="gramStart"/>
-          <w:r>
-            <w:rPr>
-              <w:sz w:val="17"/>
-            </w:rPr>
-            <w:t>office@engsurveys.com.au  |</w:t>
-          </w:r>
-          <w:proofErr w:type="gramEnd"/>
-          <w:r>
-            <w:rPr>
-              <w:sz w:val="17"/>
-            </w:rPr>
-            <w:t xml:space="preserve">  www.engsurveys.com.au</w:t>
+            <w:t>E: office@engsurveys.com.au  |  www.engsurveys.com.au</w:t>
           </w:r>
         </w:p>
         <w:p>

</xml_diff>

<commit_message>
Refactor e-signature integration: Replace DocuSign with BoldSign across the application, updating related API endpoints, environment configurations, and service logic. Remove deprecated DocuSign scripts and adjust UI components for new signing workflows. Enhance error handling and ensure consistent terminology throughout the codebase.
</commit_message>
<xml_diff>
--- a/assets/Sheets/Equipment hire lease disclaimer.docx
+++ b/assets/Sheets/Equipment hire lease disclaimer.docx
@@ -188,7 +188,25 @@
                 <w:bCs/>
                 <w:sz w:val="20"/>
               </w:rPr>
-              <w:t>[companyEntity]</w:t>
+              <w:t>[</w:t>
+            </w:r>
+            <w:proofErr w:type="spellStart"/>
+            <w:r>
+              <w:rPr>
+                <w:b/>
+                <w:bCs/>
+                <w:sz w:val="20"/>
+              </w:rPr>
+              <w:t>companyEntity</w:t>
+            </w:r>
+            <w:proofErr w:type="spellEnd"/>
+            <w:r>
+              <w:rPr>
+                <w:b/>
+                <w:bCs/>
+                <w:sz w:val="20"/>
+              </w:rPr>
+              <w:t>]</w:t>
             </w:r>
             <w:r>
               <w:rPr>
@@ -377,7 +395,25 @@
                 <w:bCs/>
                 <w:sz w:val="20"/>
               </w:rPr>
-              <w:t>[startdate]</w:t>
+              <w:t>[</w:t>
+            </w:r>
+            <w:proofErr w:type="spellStart"/>
+            <w:r>
+              <w:rPr>
+                <w:b/>
+                <w:bCs/>
+                <w:sz w:val="20"/>
+              </w:rPr>
+              <w:t>startdate</w:t>
+            </w:r>
+            <w:proofErr w:type="spellEnd"/>
+            <w:r>
+              <w:rPr>
+                <w:b/>
+                <w:bCs/>
+                <w:sz w:val="20"/>
+              </w:rPr>
+              <w:t>]</w:t>
             </w:r>
           </w:p>
         </w:tc>
@@ -432,7 +468,25 @@
                 <w:bCs/>
                 <w:sz w:val="20"/>
               </w:rPr>
-              <w:t>[starttime]</w:t>
+              <w:t>[</w:t>
+            </w:r>
+            <w:proofErr w:type="spellStart"/>
+            <w:r>
+              <w:rPr>
+                <w:b/>
+                <w:bCs/>
+                <w:sz w:val="20"/>
+              </w:rPr>
+              <w:t>starttime</w:t>
+            </w:r>
+            <w:proofErr w:type="spellEnd"/>
+            <w:r>
+              <w:rPr>
+                <w:b/>
+                <w:bCs/>
+                <w:sz w:val="20"/>
+              </w:rPr>
+              <w:t>]</w:t>
             </w:r>
           </w:p>
         </w:tc>
@@ -552,7 +606,25 @@
                 <w:bCs/>
                 <w:sz w:val="20"/>
               </w:rPr>
-              <w:t>[enddate]</w:t>
+              <w:t>[</w:t>
+            </w:r>
+            <w:proofErr w:type="spellStart"/>
+            <w:r>
+              <w:rPr>
+                <w:b/>
+                <w:bCs/>
+                <w:sz w:val="20"/>
+              </w:rPr>
+              <w:t>enddate</w:t>
+            </w:r>
+            <w:proofErr w:type="spellEnd"/>
+            <w:r>
+              <w:rPr>
+                <w:b/>
+                <w:bCs/>
+                <w:sz w:val="20"/>
+              </w:rPr>
+              <w:t>]</w:t>
             </w:r>
           </w:p>
         </w:tc>
@@ -672,7 +744,25 @@
                 <w:bCs/>
                 <w:sz w:val="20"/>
               </w:rPr>
-              <w:t>[todaysdate]</w:t>
+              <w:t>[</w:t>
+            </w:r>
+            <w:proofErr w:type="spellStart"/>
+            <w:r>
+              <w:rPr>
+                <w:b/>
+                <w:bCs/>
+                <w:sz w:val="20"/>
+              </w:rPr>
+              <w:t>todaysdate</w:t>
+            </w:r>
+            <w:proofErr w:type="spellEnd"/>
+            <w:r>
+              <w:rPr>
+                <w:b/>
+                <w:bCs/>
+                <w:sz w:val="20"/>
+              </w:rPr>
+              <w:t>]</w:t>
             </w:r>
           </w:p>
         </w:tc>
@@ -981,7 +1071,15 @@
         <w:spacing w:after="120"/>
       </w:pPr>
       <w:r>
-        <w:t>This contract is accepted by Engineering Surveys on [todaysdate].</w:t>
+        <w:t>This contract is accepted by Engineering Surveys on [</w:t>
+      </w:r>
+      <w:proofErr w:type="spellStart"/>
+      <w:r>
+        <w:t>todaysdate</w:t>
+      </w:r>
+      <w:proofErr w:type="spellEnd"/>
+      <w:r>
+        <w:t>].</w:t>
       </w:r>
     </w:p>
     <w:tbl>
@@ -1181,9 +1279,6 @@
               <w:spacing w:after="0" w:line="269" w:lineRule="auto"/>
               <w:jc w:val="center"/>
             </w:pPr>
-            <w:r>
-              <w:t>/sign_lease/</w:t>
-            </w:r>
           </w:p>
         </w:tc>
         <w:tc>
@@ -1293,7 +1388,25 @@
                 <w:bCs/>
                 <w:sz w:val="20"/>
               </w:rPr>
-              <w:t>[companyEntity]</w:t>
+              <w:t>[</w:t>
+            </w:r>
+            <w:proofErr w:type="spellStart"/>
+            <w:r>
+              <w:rPr>
+                <w:b/>
+                <w:bCs/>
+                <w:sz w:val="20"/>
+              </w:rPr>
+              <w:t>companyEntity</w:t>
+            </w:r>
+            <w:proofErr w:type="spellEnd"/>
+            <w:r>
+              <w:rPr>
+                <w:b/>
+                <w:bCs/>
+                <w:sz w:val="20"/>
+              </w:rPr>
+              <w:t>]</w:t>
             </w:r>
             <w:r>
               <w:rPr>
@@ -1473,7 +1586,25 @@
                 <w:bCs/>
                 <w:sz w:val="20"/>
               </w:rPr>
-              <w:t>[todaysdate]</w:t>
+              <w:t>[</w:t>
+            </w:r>
+            <w:proofErr w:type="spellStart"/>
+            <w:r>
+              <w:rPr>
+                <w:b/>
+                <w:bCs/>
+                <w:sz w:val="20"/>
+              </w:rPr>
+              <w:t>todaysdate</w:t>
+            </w:r>
+            <w:proofErr w:type="spellEnd"/>
+            <w:r>
+              <w:rPr>
+                <w:b/>
+                <w:bCs/>
+                <w:sz w:val="20"/>
+              </w:rPr>
+              <w:t>]</w:t>
             </w:r>
           </w:p>
         </w:tc>
@@ -1729,7 +1860,21 @@
         <w:rPr>
           <w:sz w:val="19"/>
         </w:rPr>
-        <w:t>The renter must pay to the owner any total cost of recovery, cleaning, repair, or damage arising from wilful misuse of the equipment.</w:t>
+        <w:t xml:space="preserve">The renter must pay to the owner any total cost of recovery, cleaning, repair, or damage arising from </w:t>
+      </w:r>
+      <w:proofErr w:type="spellStart"/>
+      <w:r>
+        <w:rPr>
+          <w:sz w:val="19"/>
+        </w:rPr>
+        <w:t>wilful</w:t>
+      </w:r>
+      <w:proofErr w:type="spellEnd"/>
+      <w:r>
+        <w:rPr>
+          <w:sz w:val="19"/>
+        </w:rPr>
+        <w:t xml:space="preserve"> misuse of the equipment.</w:t>
       </w:r>
     </w:p>
     <w:p>

</xml_diff>

<commit_message>
Implement admin-only access for Hire section and enhance activity logging: Update dashboard to redirect non-admin users from the Hire view to the Search screen. Enhance ActivityScreen to display detailed hire information, including signature status and hirer details. Remove deprecated BoldSign integration and streamline signing processes with self-hosted solutions. Update UI components for better user experience in document handling and notifications.
</commit_message>
<xml_diff>
--- a/assets/Sheets/Equipment hire lease disclaimer.docx
+++ b/assets/Sheets/Equipment hire lease disclaimer.docx
@@ -8,11 +8,13 @@
         <w:spacing w:before="200" w:after="40"/>
         <w:jc w:val="center"/>
         <w:rPr>
+          <w:rFonts w:ascii="Arial" w:hAnsi="Arial" w:cs="Arial"/>
           <w:u w:val="single"/>
         </w:rPr>
       </w:pPr>
       <w:r>
         <w:rPr>
+          <w:rFonts w:ascii="Arial" w:hAnsi="Arial" w:cs="Arial"/>
           <w:b/>
           <w:color w:val="183A5A"/>
           <w:sz w:val="42"/>
@@ -25,8 +27,14 @@
       <w:pPr>
         <w:keepNext/>
         <w:spacing w:before="160" w:line="288" w:lineRule="auto"/>
+        <w:rPr>
+          <w:rFonts w:ascii="Arial" w:hAnsi="Arial" w:cs="Arial"/>
+        </w:rPr>
       </w:pPr>
       <w:r>
+        <w:rPr>
+          <w:rFonts w:ascii="Arial" w:hAnsi="Arial" w:cs="Arial"/>
+        </w:rPr>
         <w:t>This lease is made and effective between Engineering Surveys Pty Ltd (Lessor) and the Lessee named below.</w:t>
       </w:r>
     </w:p>
@@ -35,9 +43,13 @@
         <w:keepNext/>
         <w:spacing w:after="100"/>
         <w:jc w:val="center"/>
+        <w:rPr>
+          <w:rFonts w:ascii="Arial" w:hAnsi="Arial" w:cs="Arial"/>
+        </w:rPr>
       </w:pPr>
       <w:r>
         <w:rPr>
+          <w:rFonts w:ascii="Arial" w:hAnsi="Arial" w:cs="Arial"/>
           <w:b/>
           <w:color w:val="183A5A"/>
           <w:sz w:val="25"/>
@@ -81,9 +93,13 @@
           <w:p>
             <w:pPr>
               <w:spacing w:after="0" w:line="269" w:lineRule="auto"/>
+              <w:rPr>
+                <w:rFonts w:ascii="Arial" w:hAnsi="Arial" w:cs="Arial"/>
+              </w:rPr>
             </w:pPr>
             <w:r>
               <w:rPr>
+                <w:rFonts w:ascii="Arial" w:hAnsi="Arial" w:cs="Arial"/>
                 <w:b/>
                 <w:color w:val="183A5A"/>
                 <w:sz w:val="18"/>
@@ -107,12 +123,14 @@
             <w:pPr>
               <w:spacing w:after="0" w:line="269" w:lineRule="auto"/>
               <w:rPr>
+                <w:rFonts w:ascii="Arial" w:hAnsi="Arial" w:cs="Arial"/>
                 <w:b/>
                 <w:bCs/>
               </w:rPr>
             </w:pPr>
             <w:r>
               <w:rPr>
+                <w:rFonts w:ascii="Arial" w:hAnsi="Arial" w:cs="Arial"/>
                 <w:b/>
                 <w:bCs/>
                 <w:sz w:val="20"/>
@@ -121,6 +139,7 @@
             </w:r>
             <w:r>
               <w:rPr>
+                <w:rFonts w:ascii="Arial" w:hAnsi="Arial" w:cs="Arial"/>
                 <w:b/>
                 <w:bCs/>
                 <w:sz w:val="20"/>
@@ -129,6 +148,7 @@
             </w:r>
             <w:r>
               <w:rPr>
+                <w:rFonts w:ascii="Arial" w:hAnsi="Arial" w:cs="Arial"/>
                 <w:b/>
                 <w:bCs/>
                 <w:sz w:val="20"/>
@@ -152,9 +172,13 @@
           <w:p>
             <w:pPr>
               <w:spacing w:after="0" w:line="269" w:lineRule="auto"/>
+              <w:rPr>
+                <w:rFonts w:ascii="Arial" w:hAnsi="Arial" w:cs="Arial"/>
+              </w:rPr>
             </w:pPr>
             <w:r>
               <w:rPr>
+                <w:rFonts w:ascii="Arial" w:hAnsi="Arial" w:cs="Arial"/>
                 <w:b/>
                 <w:color w:val="183A5A"/>
                 <w:sz w:val="18"/>
@@ -178,12 +202,14 @@
             <w:pPr>
               <w:spacing w:after="0" w:line="269" w:lineRule="auto"/>
               <w:rPr>
+                <w:rFonts w:ascii="Arial" w:hAnsi="Arial" w:cs="Arial"/>
                 <w:b/>
                 <w:bCs/>
               </w:rPr>
             </w:pPr>
             <w:r>
               <w:rPr>
+                <w:rFonts w:ascii="Arial" w:hAnsi="Arial" w:cs="Arial"/>
                 <w:b/>
                 <w:bCs/>
                 <w:sz w:val="20"/>
@@ -193,6 +219,7 @@
             <w:proofErr w:type="spellStart"/>
             <w:r>
               <w:rPr>
+                <w:rFonts w:ascii="Arial" w:hAnsi="Arial" w:cs="Arial"/>
                 <w:b/>
                 <w:bCs/>
                 <w:sz w:val="20"/>
@@ -202,6 +229,7 @@
             <w:proofErr w:type="spellEnd"/>
             <w:r>
               <w:rPr>
+                <w:rFonts w:ascii="Arial" w:hAnsi="Arial" w:cs="Arial"/>
                 <w:b/>
                 <w:bCs/>
                 <w:sz w:val="20"/>
@@ -210,6 +238,7 @@
             </w:r>
             <w:r>
               <w:rPr>
+                <w:rFonts w:ascii="Arial" w:hAnsi="Arial" w:cs="Arial"/>
                 <w:b/>
                 <w:bCs/>
                 <w:sz w:val="20"/>
@@ -218,6 +247,7 @@
             </w:r>
             <w:r>
               <w:rPr>
+                <w:rFonts w:ascii="Arial" w:hAnsi="Arial" w:cs="Arial"/>
                 <w:b/>
                 <w:bCs/>
                 <w:sz w:val="20"/>
@@ -243,9 +273,13 @@
           <w:p>
             <w:pPr>
               <w:spacing w:after="0" w:line="269" w:lineRule="auto"/>
+              <w:rPr>
+                <w:rFonts w:ascii="Arial" w:hAnsi="Arial" w:cs="Arial"/>
+              </w:rPr>
             </w:pPr>
             <w:r>
               <w:rPr>
+                <w:rFonts w:ascii="Arial" w:hAnsi="Arial" w:cs="Arial"/>
                 <w:b/>
                 <w:color w:val="183A5A"/>
                 <w:sz w:val="18"/>
@@ -270,12 +304,14 @@
             <w:pPr>
               <w:spacing w:after="0" w:line="269" w:lineRule="auto"/>
               <w:rPr>
+                <w:rFonts w:ascii="Arial" w:hAnsi="Arial" w:cs="Arial"/>
                 <w:b/>
                 <w:bCs/>
               </w:rPr>
             </w:pPr>
             <w:r>
               <w:rPr>
+                <w:rFonts w:ascii="Arial" w:hAnsi="Arial" w:cs="Arial"/>
                 <w:b/>
                 <w:bCs/>
                 <w:sz w:val="20"/>
@@ -301,9 +337,13 @@
           <w:p>
             <w:pPr>
               <w:spacing w:after="0" w:line="269" w:lineRule="auto"/>
+              <w:rPr>
+                <w:rFonts w:ascii="Arial" w:hAnsi="Arial" w:cs="Arial"/>
+              </w:rPr>
             </w:pPr>
             <w:r>
               <w:rPr>
+                <w:rFonts w:ascii="Arial" w:hAnsi="Arial" w:cs="Arial"/>
                 <w:b/>
                 <w:color w:val="183A5A"/>
                 <w:sz w:val="18"/>
@@ -328,12 +368,14 @@
             <w:pPr>
               <w:spacing w:after="0" w:line="269" w:lineRule="auto"/>
               <w:rPr>
+                <w:rFonts w:ascii="Arial" w:hAnsi="Arial" w:cs="Arial"/>
                 <w:b/>
                 <w:bCs/>
               </w:rPr>
             </w:pPr>
             <w:r>
               <w:rPr>
+                <w:rFonts w:ascii="Arial" w:hAnsi="Arial" w:cs="Arial"/>
                 <w:b/>
                 <w:bCs/>
                 <w:sz w:val="20"/>
@@ -359,9 +401,13 @@
           <w:p>
             <w:pPr>
               <w:spacing w:after="0" w:line="269" w:lineRule="auto"/>
+              <w:rPr>
+                <w:rFonts w:ascii="Arial" w:hAnsi="Arial" w:cs="Arial"/>
+              </w:rPr>
             </w:pPr>
             <w:r>
               <w:rPr>
+                <w:rFonts w:ascii="Arial" w:hAnsi="Arial" w:cs="Arial"/>
                 <w:b/>
                 <w:color w:val="183A5A"/>
                 <w:sz w:val="18"/>
@@ -385,12 +431,14 @@
             <w:pPr>
               <w:spacing w:after="0" w:line="269" w:lineRule="auto"/>
               <w:rPr>
+                <w:rFonts w:ascii="Arial" w:hAnsi="Arial" w:cs="Arial"/>
                 <w:b/>
                 <w:bCs/>
               </w:rPr>
             </w:pPr>
             <w:r>
               <w:rPr>
+                <w:rFonts w:ascii="Arial" w:hAnsi="Arial" w:cs="Arial"/>
                 <w:b/>
                 <w:bCs/>
                 <w:sz w:val="20"/>
@@ -400,6 +448,7 @@
             <w:proofErr w:type="spellStart"/>
             <w:r>
               <w:rPr>
+                <w:rFonts w:ascii="Arial" w:hAnsi="Arial" w:cs="Arial"/>
                 <w:b/>
                 <w:bCs/>
                 <w:sz w:val="20"/>
@@ -409,6 +458,7 @@
             <w:proofErr w:type="spellEnd"/>
             <w:r>
               <w:rPr>
+                <w:rFonts w:ascii="Arial" w:hAnsi="Arial" w:cs="Arial"/>
                 <w:b/>
                 <w:bCs/>
                 <w:sz w:val="20"/>
@@ -432,9 +482,13 @@
           <w:p>
             <w:pPr>
               <w:spacing w:after="0" w:line="269" w:lineRule="auto"/>
+              <w:rPr>
+                <w:rFonts w:ascii="Arial" w:hAnsi="Arial" w:cs="Arial"/>
+              </w:rPr>
             </w:pPr>
             <w:r>
               <w:rPr>
+                <w:rFonts w:ascii="Arial" w:hAnsi="Arial" w:cs="Arial"/>
                 <w:b/>
                 <w:color w:val="183A5A"/>
                 <w:sz w:val="18"/>
@@ -458,12 +512,14 @@
             <w:pPr>
               <w:spacing w:after="0" w:line="269" w:lineRule="auto"/>
               <w:rPr>
+                <w:rFonts w:ascii="Arial" w:hAnsi="Arial" w:cs="Arial"/>
                 <w:b/>
                 <w:bCs/>
               </w:rPr>
             </w:pPr>
             <w:r>
               <w:rPr>
+                <w:rFonts w:ascii="Arial" w:hAnsi="Arial" w:cs="Arial"/>
                 <w:b/>
                 <w:bCs/>
                 <w:sz w:val="20"/>
@@ -473,6 +529,7 @@
             <w:proofErr w:type="spellStart"/>
             <w:r>
               <w:rPr>
+                <w:rFonts w:ascii="Arial" w:hAnsi="Arial" w:cs="Arial"/>
                 <w:b/>
                 <w:bCs/>
                 <w:sz w:val="20"/>
@@ -482,6 +539,7 @@
             <w:proofErr w:type="spellEnd"/>
             <w:r>
               <w:rPr>
+                <w:rFonts w:ascii="Arial" w:hAnsi="Arial" w:cs="Arial"/>
                 <w:b/>
                 <w:bCs/>
                 <w:sz w:val="20"/>
@@ -507,9 +565,13 @@
           <w:p>
             <w:pPr>
               <w:spacing w:after="0" w:line="269" w:lineRule="auto"/>
+              <w:rPr>
+                <w:rFonts w:ascii="Arial" w:hAnsi="Arial" w:cs="Arial"/>
+              </w:rPr>
             </w:pPr>
             <w:r>
               <w:rPr>
+                <w:rFonts w:ascii="Arial" w:hAnsi="Arial" w:cs="Arial"/>
                 <w:b/>
                 <w:color w:val="183A5A"/>
                 <w:sz w:val="18"/>
@@ -533,12 +595,14 @@
             <w:pPr>
               <w:spacing w:after="0" w:line="269" w:lineRule="auto"/>
               <w:rPr>
+                <w:rFonts w:ascii="Arial" w:hAnsi="Arial" w:cs="Arial"/>
                 <w:b/>
                 <w:bCs/>
               </w:rPr>
             </w:pPr>
             <w:r>
               <w:rPr>
+                <w:rFonts w:ascii="Arial" w:hAnsi="Arial" w:cs="Arial"/>
                 <w:b/>
                 <w:bCs/>
                 <w:sz w:val="20"/>
@@ -547,6 +611,7 @@
             </w:r>
             <w:r>
               <w:rPr>
+                <w:rFonts w:ascii="Arial" w:hAnsi="Arial" w:cs="Arial"/>
                 <w:b/>
                 <w:bCs/>
                 <w:sz w:val="20"/>
@@ -570,9 +635,13 @@
           <w:p>
             <w:pPr>
               <w:spacing w:after="0" w:line="269" w:lineRule="auto"/>
+              <w:rPr>
+                <w:rFonts w:ascii="Arial" w:hAnsi="Arial" w:cs="Arial"/>
+              </w:rPr>
             </w:pPr>
             <w:r>
               <w:rPr>
+                <w:rFonts w:ascii="Arial" w:hAnsi="Arial" w:cs="Arial"/>
                 <w:b/>
                 <w:color w:val="183A5A"/>
                 <w:sz w:val="18"/>
@@ -596,12 +665,14 @@
             <w:pPr>
               <w:spacing w:after="0" w:line="269" w:lineRule="auto"/>
               <w:rPr>
+                <w:rFonts w:ascii="Arial" w:hAnsi="Arial" w:cs="Arial"/>
                 <w:b/>
                 <w:bCs/>
               </w:rPr>
             </w:pPr>
             <w:r>
               <w:rPr>
+                <w:rFonts w:ascii="Arial" w:hAnsi="Arial" w:cs="Arial"/>
                 <w:b/>
                 <w:bCs/>
                 <w:sz w:val="20"/>
@@ -611,6 +682,7 @@
             <w:proofErr w:type="spellStart"/>
             <w:r>
               <w:rPr>
+                <w:rFonts w:ascii="Arial" w:hAnsi="Arial" w:cs="Arial"/>
                 <w:b/>
                 <w:bCs/>
                 <w:sz w:val="20"/>
@@ -620,6 +692,7 @@
             <w:proofErr w:type="spellEnd"/>
             <w:r>
               <w:rPr>
+                <w:rFonts w:ascii="Arial" w:hAnsi="Arial" w:cs="Arial"/>
                 <w:b/>
                 <w:bCs/>
                 <w:sz w:val="20"/>
@@ -645,9 +718,13 @@
           <w:p>
             <w:pPr>
               <w:spacing w:after="0" w:line="269" w:lineRule="auto"/>
+              <w:rPr>
+                <w:rFonts w:ascii="Arial" w:hAnsi="Arial" w:cs="Arial"/>
+              </w:rPr>
             </w:pPr>
             <w:r>
               <w:rPr>
+                <w:rFonts w:ascii="Arial" w:hAnsi="Arial" w:cs="Arial"/>
                 <w:b/>
                 <w:color w:val="183A5A"/>
                 <w:sz w:val="18"/>
@@ -671,12 +748,14 @@
             <w:pPr>
               <w:spacing w:after="0" w:line="269" w:lineRule="auto"/>
               <w:rPr>
+                <w:rFonts w:ascii="Arial" w:hAnsi="Arial" w:cs="Arial"/>
                 <w:b/>
                 <w:bCs/>
               </w:rPr>
             </w:pPr>
             <w:r>
               <w:rPr>
+                <w:rFonts w:ascii="Arial" w:hAnsi="Arial" w:cs="Arial"/>
                 <w:b/>
                 <w:bCs/>
                 <w:sz w:val="20"/>
@@ -685,6 +764,7 @@
             </w:r>
             <w:r>
               <w:rPr>
+                <w:rFonts w:ascii="Arial" w:hAnsi="Arial" w:cs="Arial"/>
                 <w:b/>
                 <w:bCs/>
                 <w:sz w:val="20"/>
@@ -708,9 +788,13 @@
           <w:p>
             <w:pPr>
               <w:spacing w:after="0" w:line="269" w:lineRule="auto"/>
+              <w:rPr>
+                <w:rFonts w:ascii="Arial" w:hAnsi="Arial" w:cs="Arial"/>
+              </w:rPr>
             </w:pPr>
             <w:r>
               <w:rPr>
+                <w:rFonts w:ascii="Arial" w:hAnsi="Arial" w:cs="Arial"/>
                 <w:b/>
                 <w:color w:val="183A5A"/>
                 <w:sz w:val="18"/>
@@ -734,12 +818,14 @@
             <w:pPr>
               <w:spacing w:after="0" w:line="269" w:lineRule="auto"/>
               <w:rPr>
+                <w:rFonts w:ascii="Arial" w:hAnsi="Arial" w:cs="Arial"/>
                 <w:b/>
                 <w:bCs/>
               </w:rPr>
             </w:pPr>
             <w:r>
               <w:rPr>
+                <w:rFonts w:ascii="Arial" w:hAnsi="Arial" w:cs="Arial"/>
                 <w:b/>
                 <w:bCs/>
                 <w:sz w:val="20"/>
@@ -749,6 +835,7 @@
             <w:proofErr w:type="spellStart"/>
             <w:r>
               <w:rPr>
+                <w:rFonts w:ascii="Arial" w:hAnsi="Arial" w:cs="Arial"/>
                 <w:b/>
                 <w:bCs/>
                 <w:sz w:val="20"/>
@@ -758,6 +845,7 @@
             <w:proofErr w:type="spellEnd"/>
             <w:r>
               <w:rPr>
+                <w:rFonts w:ascii="Arial" w:hAnsi="Arial" w:cs="Arial"/>
                 <w:b/>
                 <w:bCs/>
                 <w:sz w:val="20"/>
@@ -773,9 +861,13 @@
         <w:keepNext/>
         <w:spacing w:before="200" w:after="100"/>
         <w:jc w:val="center"/>
+        <w:rPr>
+          <w:rFonts w:ascii="Arial" w:hAnsi="Arial" w:cs="Arial"/>
+        </w:rPr>
       </w:pPr>
       <w:r>
         <w:rPr>
+          <w:rFonts w:ascii="Arial" w:hAnsi="Arial" w:cs="Arial"/>
           <w:b/>
           <w:color w:val="183A5A"/>
           <w:sz w:val="25"/>
@@ -817,9 +909,13 @@
           <w:p>
             <w:pPr>
               <w:spacing w:after="0" w:line="269" w:lineRule="auto"/>
+              <w:rPr>
+                <w:rFonts w:ascii="Arial" w:hAnsi="Arial" w:cs="Arial"/>
+              </w:rPr>
             </w:pPr>
             <w:r>
               <w:rPr>
+                <w:rFonts w:ascii="Arial" w:hAnsi="Arial" w:cs="Arial"/>
                 <w:b/>
                 <w:color w:val="183A5A"/>
                 <w:sz w:val="18"/>
@@ -842,21 +938,27 @@
           <w:p>
             <w:pPr>
               <w:spacing w:after="0" w:line="269" w:lineRule="auto"/>
+              <w:rPr>
+                <w:rFonts w:ascii="Arial" w:hAnsi="Arial" w:cs="Arial"/>
+              </w:rPr>
             </w:pPr>
             <w:r>
               <w:rPr>
+                <w:rFonts w:ascii="Arial" w:hAnsi="Arial" w:cs="Arial"/>
                 <w:sz w:val="20"/>
               </w:rPr>
               <w:t xml:space="preserve"> [</w:t>
             </w:r>
             <w:r>
               <w:rPr>
+                <w:rFonts w:ascii="Arial" w:hAnsi="Arial" w:cs="Arial"/>
                 <w:sz w:val="20"/>
               </w:rPr>
               <w:t>description</w:t>
             </w:r>
             <w:r>
               <w:rPr>
+                <w:rFonts w:ascii="Arial" w:hAnsi="Arial" w:cs="Arial"/>
                 <w:sz w:val="20"/>
               </w:rPr>
               <w:t>]</w:t>
@@ -880,9 +982,13 @@
           <w:p>
             <w:pPr>
               <w:spacing w:after="0" w:line="269" w:lineRule="auto"/>
+              <w:rPr>
+                <w:rFonts w:ascii="Arial" w:hAnsi="Arial" w:cs="Arial"/>
+              </w:rPr>
             </w:pPr>
             <w:r>
               <w:rPr>
+                <w:rFonts w:ascii="Arial" w:hAnsi="Arial" w:cs="Arial"/>
                 <w:b/>
                 <w:color w:val="183A5A"/>
                 <w:sz w:val="18"/>
@@ -905,9 +1011,13 @@
           <w:p>
             <w:pPr>
               <w:spacing w:after="0" w:line="269" w:lineRule="auto"/>
+              <w:rPr>
+                <w:rFonts w:ascii="Arial" w:hAnsi="Arial" w:cs="Arial"/>
+              </w:rPr>
             </w:pPr>
             <w:r>
               <w:rPr>
+                <w:rFonts w:ascii="Arial" w:hAnsi="Arial" w:cs="Arial"/>
                 <w:sz w:val="20"/>
               </w:rPr>
               <w:t>[serial]</w:t>
@@ -931,9 +1041,13 @@
           <w:p>
             <w:pPr>
               <w:spacing w:after="0" w:line="269" w:lineRule="auto"/>
+              <w:rPr>
+                <w:rFonts w:ascii="Arial" w:hAnsi="Arial" w:cs="Arial"/>
+              </w:rPr>
             </w:pPr>
             <w:r>
               <w:rPr>
+                <w:rFonts w:ascii="Arial" w:hAnsi="Arial" w:cs="Arial"/>
                 <w:b/>
                 <w:color w:val="183A5A"/>
                 <w:sz w:val="18"/>
@@ -957,12 +1071,14 @@
             <w:pPr>
               <w:spacing w:after="0" w:line="269" w:lineRule="auto"/>
               <w:rPr>
+                <w:rFonts w:ascii="Arial" w:hAnsi="Arial" w:cs="Arial"/>
                 <w:b/>
                 <w:bCs/>
               </w:rPr>
             </w:pPr>
             <w:r>
               <w:rPr>
+                <w:rFonts w:ascii="Arial" w:hAnsi="Arial" w:cs="Arial"/>
                 <w:b/>
                 <w:bCs/>
                 <w:sz w:val="20"/>
@@ -976,6 +1092,9 @@
     <w:p>
       <w:pPr>
         <w:ind w:left="-142" w:hanging="142"/>
+        <w:rPr>
+          <w:rFonts w:ascii="Arial" w:hAnsi="Arial" w:cs="Arial"/>
+        </w:rPr>
       </w:pPr>
     </w:p>
     <w:p>
@@ -983,9 +1102,13 @@
         <w:keepNext/>
         <w:spacing w:before="200" w:after="100"/>
         <w:jc w:val="center"/>
+        <w:rPr>
+          <w:rFonts w:ascii="Arial" w:hAnsi="Arial" w:cs="Arial"/>
+        </w:rPr>
       </w:pPr>
       <w:r>
         <w:rPr>
+          <w:rFonts w:ascii="Arial" w:hAnsi="Arial" w:cs="Arial"/>
           <w:b/>
           <w:color w:val="183A5A"/>
           <w:sz w:val="25"/>
@@ -1028,9 +1151,13 @@
             <w:pPr>
               <w:spacing w:after="0" w:line="269" w:lineRule="auto"/>
               <w:ind w:right="-125"/>
+              <w:rPr>
+                <w:rFonts w:ascii="Arial" w:hAnsi="Arial" w:cs="Arial"/>
+              </w:rPr>
             </w:pPr>
             <w:r>
               <w:rPr>
+                <w:rFonts w:ascii="Arial" w:hAnsi="Arial" w:cs="Arial"/>
                 <w:b/>
                 <w:sz w:val="20"/>
               </w:rPr>
@@ -1045,6 +1172,7 @@
         <w:keepNext/>
         <w:spacing w:after="100"/>
         <w:rPr>
+          <w:rFonts w:ascii="Arial" w:hAnsi="Arial" w:cs="Arial"/>
           <w:b/>
           <w:color w:val="183A5A"/>
           <w:sz w:val="25"/>
@@ -1056,9 +1184,13 @@
         <w:keepNext/>
         <w:spacing w:after="100"/>
         <w:jc w:val="center"/>
+        <w:rPr>
+          <w:rFonts w:ascii="Arial" w:hAnsi="Arial" w:cs="Arial"/>
+        </w:rPr>
       </w:pPr>
       <w:r>
         <w:rPr>
+          <w:rFonts w:ascii="Arial" w:hAnsi="Arial" w:cs="Arial"/>
           <w:b/>
           <w:color w:val="183A5A"/>
           <w:sz w:val="25"/>
@@ -1069,16 +1201,28 @@
     <w:p>
       <w:pPr>
         <w:spacing w:after="120"/>
+        <w:rPr>
+          <w:rFonts w:ascii="Arial" w:hAnsi="Arial" w:cs="Arial"/>
+        </w:rPr>
       </w:pPr>
       <w:r>
+        <w:rPr>
+          <w:rFonts w:ascii="Arial" w:hAnsi="Arial" w:cs="Arial"/>
+        </w:rPr>
         <w:t>This contract is accepted by Engineering Surveys on [</w:t>
       </w:r>
       <w:proofErr w:type="spellStart"/>
       <w:r>
+        <w:rPr>
+          <w:rFonts w:ascii="Arial" w:hAnsi="Arial" w:cs="Arial"/>
+        </w:rPr>
         <w:t>todaysdate</w:t>
       </w:r>
       <w:proofErr w:type="spellEnd"/>
       <w:r>
+        <w:rPr>
+          <w:rFonts w:ascii="Arial" w:hAnsi="Arial" w:cs="Arial"/>
+        </w:rPr>
         <w:t>].</w:t>
       </w:r>
     </w:p>
@@ -1121,9 +1265,13 @@
           <w:p>
             <w:pPr>
               <w:spacing w:after="0" w:line="269" w:lineRule="auto"/>
+              <w:rPr>
+                <w:rFonts w:ascii="Arial" w:hAnsi="Arial" w:cs="Arial"/>
+              </w:rPr>
             </w:pPr>
             <w:r>
               <w:rPr>
+                <w:rFonts w:ascii="Arial" w:hAnsi="Arial" w:cs="Arial"/>
                 <w:b/>
                 <w:color w:val="183A5A"/>
                 <w:sz w:val="18"/>
@@ -1149,33 +1297,24 @@
                 <w:bottom w:val="single" w:sz="8" w:space="1" w:color="D7DEE8"/>
               </w:pBdr>
               <w:spacing w:after="0" w:line="269" w:lineRule="auto"/>
+              <w:rPr>
+                <w:rFonts w:ascii="Arial" w:hAnsi="Arial" w:cs="Arial"/>
+              </w:rPr>
             </w:pPr>
             <w:r>
+              <w:rPr>
+                <w:rFonts w:ascii="Arial" w:hAnsi="Arial" w:cs="Arial"/>
+              </w:rPr>
               <w:t xml:space="preserve"> </w:t>
             </w:r>
             <w:r>
               <w:rPr>
+                <w:rFonts w:ascii="Arial" w:hAnsi="Arial" w:cs="Arial"/>
                 <w:b/>
                 <w:bCs/>
                 <w:sz w:val="20"/>
               </w:rPr>
-              <w:t>[</w:t>
-            </w:r>
-            <w:r>
-              <w:rPr>
-                <w:b/>
-                <w:bCs/>
-                <w:sz w:val="20"/>
-              </w:rPr>
-              <w:t>name</w:t>
-            </w:r>
-            <w:r>
-              <w:rPr>
-                <w:b/>
-                <w:bCs/>
-                <w:sz w:val="20"/>
-              </w:rPr>
-              <w:t>]</w:t>
+              <w:t>[name]</w:t>
             </w:r>
           </w:p>
         </w:tc>
@@ -1194,9 +1333,13 @@
           <w:p>
             <w:pPr>
               <w:spacing w:after="0" w:line="269" w:lineRule="auto"/>
+              <w:rPr>
+                <w:rFonts w:ascii="Arial" w:hAnsi="Arial" w:cs="Arial"/>
+              </w:rPr>
             </w:pPr>
             <w:r>
               <w:rPr>
+                <w:rFonts w:ascii="Arial" w:hAnsi="Arial" w:cs="Arial"/>
                 <w:b/>
                 <w:color w:val="183A5A"/>
                 <w:sz w:val="18"/>
@@ -1219,9 +1362,13 @@
           <w:p>
             <w:pPr>
               <w:spacing w:after="0" w:line="269" w:lineRule="auto"/>
+              <w:rPr>
+                <w:rFonts w:ascii="Arial" w:hAnsi="Arial" w:cs="Arial"/>
+              </w:rPr>
             </w:pPr>
             <w:r>
               <w:rPr>
+                <w:rFonts w:ascii="Arial" w:hAnsi="Arial" w:cs="Arial"/>
                 <w:b/>
                 <w:sz w:val="20"/>
               </w:rPr>
@@ -1249,9 +1396,13 @@
           <w:p>
             <w:pPr>
               <w:spacing w:after="0" w:line="269" w:lineRule="auto"/>
+              <w:rPr>
+                <w:rFonts w:ascii="Arial" w:hAnsi="Arial" w:cs="Arial"/>
+              </w:rPr>
             </w:pPr>
             <w:r>
               <w:rPr>
+                <w:rFonts w:ascii="Arial" w:hAnsi="Arial" w:cs="Arial"/>
                 <w:b/>
                 <w:color w:val="183A5A"/>
                 <w:sz w:val="18"/>
@@ -1277,8 +1428,33 @@
                 <w:bottom w:val="single" w:sz="8" w:space="1" w:color="D7DEE8"/>
               </w:pBdr>
               <w:spacing w:after="0" w:line="269" w:lineRule="auto"/>
-              <w:jc w:val="center"/>
+              <w:rPr>
+                <w:rFonts w:ascii="Arial" w:hAnsi="Arial" w:cs="Arial"/>
+              </w:rPr>
             </w:pPr>
+            <w:r>
+              <w:rPr>
+                <w:rFonts w:ascii="Arial" w:hAnsi="Arial" w:cs="Arial"/>
+                <w:sz w:val="16"/>
+              </w:rPr>
+              <w:t>[</w:t>
+            </w:r>
+            <w:proofErr w:type="spellStart"/>
+            <w:r>
+              <w:rPr>
+                <w:rFonts w:ascii="Arial" w:hAnsi="Arial" w:cs="Arial"/>
+                <w:sz w:val="16"/>
+              </w:rPr>
+              <w:t>lesseeSignature</w:t>
+            </w:r>
+            <w:proofErr w:type="spellEnd"/>
+            <w:r>
+              <w:rPr>
+                <w:rFonts w:ascii="Arial" w:hAnsi="Arial" w:cs="Arial"/>
+                <w:sz w:val="16"/>
+              </w:rPr>
+              <w:t>]</w:t>
+            </w:r>
           </w:p>
         </w:tc>
         <w:tc>
@@ -1296,9 +1472,13 @@
           <w:p>
             <w:pPr>
               <w:spacing w:after="0" w:line="269" w:lineRule="auto"/>
+              <w:rPr>
+                <w:rFonts w:ascii="Arial" w:hAnsi="Arial" w:cs="Arial"/>
+              </w:rPr>
             </w:pPr>
             <w:r>
               <w:rPr>
+                <w:rFonts w:ascii="Arial" w:hAnsi="Arial" w:cs="Arial"/>
                 <w:b/>
                 <w:color w:val="183A5A"/>
                 <w:sz w:val="18"/>
@@ -1324,8 +1504,14 @@
                 <w:bottom w:val="single" w:sz="8" w:space="1" w:color="D7DEE8"/>
               </w:pBdr>
               <w:spacing w:after="0" w:line="269" w:lineRule="auto"/>
+              <w:rPr>
+                <w:rFonts w:ascii="Arial" w:hAnsi="Arial" w:cs="Arial"/>
+              </w:rPr>
             </w:pPr>
             <w:r>
+              <w:rPr>
+                <w:rFonts w:ascii="Arial" w:hAnsi="Arial" w:cs="Arial"/>
+              </w:rPr>
               <w:t xml:space="preserve"> </w:t>
             </w:r>
           </w:p>
@@ -1350,9 +1536,13 @@
           <w:p>
             <w:pPr>
               <w:spacing w:after="0" w:line="269" w:lineRule="auto"/>
+              <w:rPr>
+                <w:rFonts w:ascii="Arial" w:hAnsi="Arial" w:cs="Arial"/>
+              </w:rPr>
             </w:pPr>
             <w:r>
               <w:rPr>
+                <w:rFonts w:ascii="Arial" w:hAnsi="Arial" w:cs="Arial"/>
                 <w:b/>
                 <w:color w:val="183A5A"/>
                 <w:sz w:val="18"/>
@@ -1378,12 +1568,19 @@
                 <w:bottom w:val="single" w:sz="8" w:space="1" w:color="D7DEE8"/>
               </w:pBdr>
               <w:spacing w:after="0" w:line="269" w:lineRule="auto"/>
+              <w:rPr>
+                <w:rFonts w:ascii="Arial" w:hAnsi="Arial" w:cs="Arial"/>
+              </w:rPr>
             </w:pPr>
             <w:r>
+              <w:rPr>
+                <w:rFonts w:ascii="Arial" w:hAnsi="Arial" w:cs="Arial"/>
+              </w:rPr>
               <w:t xml:space="preserve"> </w:t>
             </w:r>
             <w:r>
               <w:rPr>
+                <w:rFonts w:ascii="Arial" w:hAnsi="Arial" w:cs="Arial"/>
                 <w:b/>
                 <w:bCs/>
                 <w:sz w:val="20"/>
@@ -1393,6 +1590,7 @@
             <w:proofErr w:type="spellStart"/>
             <w:r>
               <w:rPr>
+                <w:rFonts w:ascii="Arial" w:hAnsi="Arial" w:cs="Arial"/>
                 <w:b/>
                 <w:bCs/>
                 <w:sz w:val="20"/>
@@ -1402,6 +1600,7 @@
             <w:proofErr w:type="spellEnd"/>
             <w:r>
               <w:rPr>
+                <w:rFonts w:ascii="Arial" w:hAnsi="Arial" w:cs="Arial"/>
                 <w:b/>
                 <w:bCs/>
                 <w:sz w:val="20"/>
@@ -1410,18 +1609,12 @@
             </w:r>
             <w:r>
               <w:rPr>
+                <w:rFonts w:ascii="Arial" w:hAnsi="Arial" w:cs="Arial"/>
                 <w:b/>
                 <w:bCs/>
                 <w:sz w:val="20"/>
               </w:rPr>
               <w:br/>
-            </w:r>
-            <w:r>
-              <w:rPr>
-                <w:b/>
-                <w:bCs/>
-                <w:sz w:val="20"/>
-              </w:rPr>
               <w:t>[project]</w:t>
             </w:r>
           </w:p>
@@ -1441,9 +1634,13 @@
           <w:p>
             <w:pPr>
               <w:spacing w:after="0" w:line="269" w:lineRule="auto"/>
+              <w:rPr>
+                <w:rFonts w:ascii="Arial" w:hAnsi="Arial" w:cs="Arial"/>
+              </w:rPr>
             </w:pPr>
             <w:r>
               <w:rPr>
+                <w:rFonts w:ascii="Arial" w:hAnsi="Arial" w:cs="Arial"/>
                 <w:b/>
                 <w:color w:val="183A5A"/>
                 <w:sz w:val="18"/>
@@ -1467,12 +1664,14 @@
             <w:pPr>
               <w:spacing w:after="0" w:line="269" w:lineRule="auto"/>
               <w:rPr>
+                <w:rFonts w:ascii="Arial" w:hAnsi="Arial" w:cs="Arial"/>
                 <w:b/>
                 <w:bCs/>
               </w:rPr>
             </w:pPr>
             <w:r>
               <w:rPr>
+                <w:rFonts w:ascii="Arial" w:hAnsi="Arial" w:cs="Arial"/>
                 <w:b/>
                 <w:bCs/>
                 <w:sz w:val="20"/>
@@ -1501,9 +1700,13 @@
           <w:p>
             <w:pPr>
               <w:spacing w:after="0" w:line="269" w:lineRule="auto"/>
+              <w:rPr>
+                <w:rFonts w:ascii="Arial" w:hAnsi="Arial" w:cs="Arial"/>
+              </w:rPr>
             </w:pPr>
             <w:r>
               <w:rPr>
+                <w:rFonts w:ascii="Arial" w:hAnsi="Arial" w:cs="Arial"/>
                 <w:b/>
                 <w:color w:val="183A5A"/>
                 <w:sz w:val="18"/>
@@ -1529,9 +1732,16 @@
                 <w:bottom w:val="single" w:sz="8" w:space="1" w:color="D7DEE8"/>
               </w:pBdr>
               <w:spacing w:after="0" w:line="269" w:lineRule="auto"/>
+              <w:rPr>
+                <w:rFonts w:ascii="Arial" w:hAnsi="Arial" w:cs="Arial"/>
+              </w:rPr>
             </w:pPr>
             <w:r>
-              <w:t xml:space="preserve"> </w:t>
+              <w:rPr>
+                <w:rFonts w:ascii="Arial" w:hAnsi="Arial" w:cs="Arial"/>
+                <w:sz w:val="16"/>
+              </w:rPr>
+              <w:t>[lesseeSigDate]</w:t>
             </w:r>
           </w:p>
         </w:tc>
@@ -1550,9 +1760,13 @@
           <w:p>
             <w:pPr>
               <w:spacing w:after="0" w:line="269" w:lineRule="auto"/>
+              <w:rPr>
+                <w:rFonts w:ascii="Arial" w:hAnsi="Arial" w:cs="Arial"/>
+              </w:rPr>
             </w:pPr>
             <w:r>
               <w:rPr>
+                <w:rFonts w:ascii="Arial" w:hAnsi="Arial" w:cs="Arial"/>
                 <w:b/>
                 <w:color w:val="183A5A"/>
                 <w:sz w:val="18"/>
@@ -1576,12 +1790,14 @@
             <w:pPr>
               <w:spacing w:after="0" w:line="269" w:lineRule="auto"/>
               <w:rPr>
+                <w:rFonts w:ascii="Arial" w:hAnsi="Arial" w:cs="Arial"/>
                 <w:b/>
                 <w:bCs/>
               </w:rPr>
             </w:pPr>
             <w:r>
               <w:rPr>
+                <w:rFonts w:ascii="Arial" w:hAnsi="Arial" w:cs="Arial"/>
                 <w:b/>
                 <w:bCs/>
                 <w:sz w:val="20"/>
@@ -1591,6 +1807,7 @@
             <w:proofErr w:type="spellStart"/>
             <w:r>
               <w:rPr>
+                <w:rFonts w:ascii="Arial" w:hAnsi="Arial" w:cs="Arial"/>
                 <w:b/>
                 <w:bCs/>
                 <w:sz w:val="20"/>
@@ -1600,6 +1817,7 @@
             <w:proofErr w:type="spellEnd"/>
             <w:r>
               <w:rPr>
+                <w:rFonts w:ascii="Arial" w:hAnsi="Arial" w:cs="Arial"/>
                 <w:b/>
                 <w:bCs/>
                 <w:sz w:val="20"/>
@@ -1618,11 +1836,16 @@
         <w:ind w:left="-142"/>
         <w:jc w:val="center"/>
         <w:rPr>
+          <w:rFonts w:ascii="Arial" w:hAnsi="Arial" w:cs="Arial"/>
+          <w:b/>
+          <w:color w:val="183A5A"/>
+          <w:sz w:val="36"/>
           <w:u w:val="single"/>
         </w:rPr>
       </w:pPr>
       <w:r>
         <w:rPr>
+          <w:rFonts w:ascii="Arial" w:hAnsi="Arial" w:cs="Arial"/>
           <w:b/>
           <w:color w:val="183A5A"/>
           <w:sz w:val="36"/>
@@ -1634,21 +1857,42 @@
     </w:p>
     <w:p>
       <w:pPr>
+        <w:keepNext/>
+        <w:spacing w:before="240" w:after="40"/>
+        <w:ind w:left="-142"/>
+        <w:jc w:val="center"/>
+        <w:rPr>
+          <w:rFonts w:ascii="Arial" w:hAnsi="Arial" w:cs="Arial"/>
+          <w:u w:val="single"/>
+        </w:rPr>
+      </w:pPr>
+    </w:p>
+    <w:p>
+      <w:pPr>
         <w:keepLines/>
         <w:spacing w:after="100" w:line="259" w:lineRule="auto"/>
         <w:ind w:left="-142" w:hanging="142"/>
+        <w:rPr>
+          <w:rFonts w:ascii="Arial" w:hAnsi="Arial" w:cs="Arial"/>
+          <w:sz w:val="18"/>
+          <w:szCs w:val="18"/>
+        </w:rPr>
       </w:pPr>
       <w:r>
         <w:rPr>
+          <w:rFonts w:ascii="Arial" w:hAnsi="Arial" w:cs="Arial"/>
           <w:b/>
           <w:color w:val="183A5A"/>
-          <w:sz w:val="19"/>
+          <w:sz w:val="18"/>
+          <w:szCs w:val="18"/>
         </w:rPr>
         <w:t xml:space="preserve">1. </w:t>
       </w:r>
       <w:r>
         <w:rPr>
-          <w:sz w:val="19"/>
+          <w:rFonts w:ascii="Arial" w:hAnsi="Arial" w:cs="Arial"/>
+          <w:sz w:val="18"/>
+          <w:szCs w:val="18"/>
         </w:rPr>
         <w:t>Engineering Surveys Pty Ltd, its affiliates, and its employees expressly disclaim all liability to any person for anything done or omitted to be done in whole or in part in reliance on any information accessed through the use of this equipment.</w:t>
       </w:r>
@@ -1658,18 +1902,27 @@
         <w:keepLines/>
         <w:spacing w:after="100" w:line="259" w:lineRule="auto"/>
         <w:ind w:left="-142" w:hanging="142"/>
+        <w:rPr>
+          <w:rFonts w:ascii="Arial" w:hAnsi="Arial" w:cs="Arial"/>
+          <w:sz w:val="18"/>
+          <w:szCs w:val="18"/>
+        </w:rPr>
       </w:pPr>
       <w:r>
         <w:rPr>
+          <w:rFonts w:ascii="Arial" w:hAnsi="Arial" w:cs="Arial"/>
           <w:b/>
           <w:color w:val="183A5A"/>
-          <w:sz w:val="19"/>
+          <w:sz w:val="18"/>
+          <w:szCs w:val="18"/>
         </w:rPr>
         <w:t xml:space="preserve">2. </w:t>
       </w:r>
       <w:r>
         <w:rPr>
-          <w:sz w:val="19"/>
+          <w:rFonts w:ascii="Arial" w:hAnsi="Arial" w:cs="Arial"/>
+          <w:sz w:val="18"/>
+          <w:szCs w:val="18"/>
         </w:rPr>
         <w:t>The materials provided by Engineering Surveys are provided “as is”. To the maximum extent permitted by law, Engineering Surveys makes no representations or warranties of any kind, whether express or implied, including, without limitation, warranties of merchantability, fitness for a particular purpose, or non-infringement of intellectual property. Engineering Surveys does not warrant the accuracy or completeness of information accessed through use of this equipment.</w:t>
       </w:r>
@@ -1679,18 +1932,27 @@
         <w:keepLines/>
         <w:spacing w:after="100" w:line="259" w:lineRule="auto"/>
         <w:ind w:left="-142" w:hanging="142"/>
+        <w:rPr>
+          <w:rFonts w:ascii="Arial" w:hAnsi="Arial" w:cs="Arial"/>
+          <w:sz w:val="18"/>
+          <w:szCs w:val="18"/>
+        </w:rPr>
       </w:pPr>
       <w:r>
         <w:rPr>
+          <w:rFonts w:ascii="Arial" w:hAnsi="Arial" w:cs="Arial"/>
           <w:b/>
           <w:color w:val="183A5A"/>
-          <w:sz w:val="19"/>
+          <w:sz w:val="18"/>
+          <w:szCs w:val="18"/>
         </w:rPr>
         <w:t xml:space="preserve">3. </w:t>
       </w:r>
       <w:r>
         <w:rPr>
-          <w:sz w:val="19"/>
+          <w:rFonts w:ascii="Arial" w:hAnsi="Arial" w:cs="Arial"/>
+          <w:sz w:val="18"/>
+          <w:szCs w:val="18"/>
         </w:rPr>
         <w:t>To the maximum extent permitted by law, Engineering Surveys and its affiliates will not be liable for any damages whatsoever, including without limitation direct, indirect, punitive, special, or consequential damages, lost profits, lost data, or business interruption, arising out of the use, inability to use, or results of use of this equipment, whether based on contract, tort, statute, common law, equity, or any other legal theory, and whether or not advised of the possibility of such damages. If circumstances arise where you are entitled to claim damages from Engineering Surveys notwithstanding these terms, our aggregate liability to you is limited, at our election, to the re-supply of the services or the cost of re-supplying the services.</w:t>
       </w:r>
@@ -1700,18 +1962,27 @@
         <w:keepLines/>
         <w:spacing w:after="100" w:line="259" w:lineRule="auto"/>
         <w:ind w:left="-142" w:hanging="142"/>
+        <w:rPr>
+          <w:rFonts w:ascii="Arial" w:hAnsi="Arial" w:cs="Arial"/>
+          <w:sz w:val="18"/>
+          <w:szCs w:val="18"/>
+        </w:rPr>
       </w:pPr>
       <w:r>
         <w:rPr>
+          <w:rFonts w:ascii="Arial" w:hAnsi="Arial" w:cs="Arial"/>
           <w:b/>
           <w:color w:val="183A5A"/>
-          <w:sz w:val="19"/>
+          <w:sz w:val="18"/>
+          <w:szCs w:val="18"/>
         </w:rPr>
         <w:t xml:space="preserve">4. </w:t>
       </w:r>
       <w:r>
         <w:rPr>
-          <w:sz w:val="19"/>
+          <w:rFonts w:ascii="Arial" w:hAnsi="Arial" w:cs="Arial"/>
+          <w:sz w:val="18"/>
+          <w:szCs w:val="18"/>
         </w:rPr>
         <w:t>If any provision of these terms is unlawful, void, or unenforceable for any reason, that provision will be deemed severed and will not affect the validity and enforceability of the remaining provisions.</w:t>
       </w:r>
@@ -1721,18 +1992,27 @@
         <w:keepLines/>
         <w:spacing w:after="100" w:line="259" w:lineRule="auto"/>
         <w:ind w:left="-142" w:hanging="142"/>
+        <w:rPr>
+          <w:rFonts w:ascii="Arial" w:hAnsi="Arial" w:cs="Arial"/>
+          <w:sz w:val="18"/>
+          <w:szCs w:val="18"/>
+        </w:rPr>
       </w:pPr>
       <w:r>
         <w:rPr>
+          <w:rFonts w:ascii="Arial" w:hAnsi="Arial" w:cs="Arial"/>
           <w:b/>
           <w:color w:val="183A5A"/>
-          <w:sz w:val="19"/>
+          <w:sz w:val="18"/>
+          <w:szCs w:val="18"/>
         </w:rPr>
         <w:t xml:space="preserve">5. </w:t>
       </w:r>
       <w:r>
         <w:rPr>
-          <w:sz w:val="19"/>
+          <w:rFonts w:ascii="Arial" w:hAnsi="Arial" w:cs="Arial"/>
+          <w:sz w:val="18"/>
+          <w:szCs w:val="18"/>
         </w:rPr>
         <w:t>Engineering Surveys may revise these terms at any time by updating this disclaimer. You are bound by such revisions and should therefore review this document regularly.</w:t>
       </w:r>
@@ -1742,18 +2022,27 @@
         <w:keepLines/>
         <w:spacing w:after="100" w:line="259" w:lineRule="auto"/>
         <w:ind w:left="-142" w:hanging="142"/>
+        <w:rPr>
+          <w:rFonts w:ascii="Arial" w:hAnsi="Arial" w:cs="Arial"/>
+          <w:sz w:val="18"/>
+          <w:szCs w:val="18"/>
+        </w:rPr>
       </w:pPr>
       <w:r>
         <w:rPr>
+          <w:rFonts w:ascii="Arial" w:hAnsi="Arial" w:cs="Arial"/>
           <w:b/>
           <w:color w:val="183A5A"/>
-          <w:sz w:val="19"/>
+          <w:sz w:val="18"/>
+          <w:szCs w:val="18"/>
         </w:rPr>
         <w:t xml:space="preserve">6. </w:t>
       </w:r>
       <w:r>
         <w:rPr>
-          <w:sz w:val="19"/>
+          <w:rFonts w:ascii="Arial" w:hAnsi="Arial" w:cs="Arial"/>
+          <w:sz w:val="18"/>
+          <w:szCs w:val="18"/>
         </w:rPr>
         <w:t>“Lessor” means Engineering Surveys Pty Ltd trading as Engineering Surveys of 4/11 Ridley Street, Hindmarsh SA 5007.</w:t>
       </w:r>
@@ -1763,18 +2052,27 @@
         <w:keepLines/>
         <w:spacing w:after="100" w:line="259" w:lineRule="auto"/>
         <w:ind w:left="-142" w:hanging="142"/>
+        <w:rPr>
+          <w:rFonts w:ascii="Arial" w:hAnsi="Arial" w:cs="Arial"/>
+          <w:sz w:val="18"/>
+          <w:szCs w:val="18"/>
+        </w:rPr>
       </w:pPr>
       <w:r>
         <w:rPr>
+          <w:rFonts w:ascii="Arial" w:hAnsi="Arial" w:cs="Arial"/>
           <w:b/>
           <w:color w:val="183A5A"/>
-          <w:sz w:val="19"/>
+          <w:sz w:val="18"/>
+          <w:szCs w:val="18"/>
         </w:rPr>
         <w:t xml:space="preserve">7. </w:t>
       </w:r>
       <w:r>
         <w:rPr>
-          <w:sz w:val="19"/>
+          <w:rFonts w:ascii="Arial" w:hAnsi="Arial" w:cs="Arial"/>
+          <w:sz w:val="18"/>
+          <w:szCs w:val="18"/>
         </w:rPr>
         <w:t>“Equipment” means any equipment rented under this agreement and includes all accessories either fitted to or supplied with the equipment.</w:t>
       </w:r>
@@ -1784,18 +2082,27 @@
         <w:keepLines/>
         <w:spacing w:after="100" w:line="259" w:lineRule="auto"/>
         <w:ind w:left="-142" w:hanging="142"/>
+        <w:rPr>
+          <w:rFonts w:ascii="Arial" w:hAnsi="Arial" w:cs="Arial"/>
+          <w:sz w:val="18"/>
+          <w:szCs w:val="18"/>
+        </w:rPr>
       </w:pPr>
       <w:r>
         <w:rPr>
+          <w:rFonts w:ascii="Arial" w:hAnsi="Arial" w:cs="Arial"/>
           <w:b/>
           <w:color w:val="183A5A"/>
-          <w:sz w:val="19"/>
+          <w:sz w:val="18"/>
+          <w:szCs w:val="18"/>
         </w:rPr>
         <w:t xml:space="preserve">8. </w:t>
       </w:r>
       <w:r>
         <w:rPr>
-          <w:sz w:val="19"/>
+          <w:rFonts w:ascii="Arial" w:hAnsi="Arial" w:cs="Arial"/>
+          <w:sz w:val="18"/>
+          <w:szCs w:val="18"/>
         </w:rPr>
         <w:t>“Lessee” means the person and/or company signing this agreement, or on whose behalf this agreement is signed, and who declares that all information provided is true and accurate.</w:t>
       </w:r>
@@ -1805,18 +2112,27 @@
         <w:keepLines/>
         <w:spacing w:after="100" w:line="259" w:lineRule="auto"/>
         <w:ind w:left="-142" w:hanging="142"/>
+        <w:rPr>
+          <w:rFonts w:ascii="Arial" w:hAnsi="Arial" w:cs="Arial"/>
+          <w:sz w:val="18"/>
+          <w:szCs w:val="18"/>
+        </w:rPr>
       </w:pPr>
       <w:r>
         <w:rPr>
+          <w:rFonts w:ascii="Arial" w:hAnsi="Arial" w:cs="Arial"/>
           <w:b/>
           <w:color w:val="183A5A"/>
-          <w:sz w:val="19"/>
+          <w:sz w:val="18"/>
+          <w:szCs w:val="18"/>
         </w:rPr>
         <w:t xml:space="preserve">9. </w:t>
       </w:r>
       <w:r>
         <w:rPr>
-          <w:sz w:val="19"/>
+          <w:rFonts w:ascii="Arial" w:hAnsi="Arial" w:cs="Arial"/>
+          <w:sz w:val="18"/>
+          <w:szCs w:val="18"/>
         </w:rPr>
         <w:t>The renter must not permit the equipment to be used by any person other than the renter or the renter’s nominated persons.</w:t>
       </w:r>
@@ -1826,18 +2142,27 @@
         <w:keepLines/>
         <w:spacing w:after="100" w:line="259" w:lineRule="auto"/>
         <w:ind w:left="-142" w:hanging="142"/>
+        <w:rPr>
+          <w:rFonts w:ascii="Arial" w:hAnsi="Arial" w:cs="Arial"/>
+          <w:sz w:val="18"/>
+          <w:szCs w:val="18"/>
+        </w:rPr>
       </w:pPr>
       <w:r>
         <w:rPr>
+          <w:rFonts w:ascii="Arial" w:hAnsi="Arial" w:cs="Arial"/>
           <w:b/>
           <w:color w:val="183A5A"/>
-          <w:sz w:val="19"/>
+          <w:sz w:val="18"/>
+          <w:szCs w:val="18"/>
         </w:rPr>
         <w:t xml:space="preserve">10. </w:t>
       </w:r>
       <w:r>
         <w:rPr>
-          <w:sz w:val="19"/>
+          <w:rFonts w:ascii="Arial" w:hAnsi="Arial" w:cs="Arial"/>
+          <w:sz w:val="18"/>
+          <w:szCs w:val="18"/>
         </w:rPr>
         <w:t>In the event of loss of or damage to the equipment, or any incident that may give rise to a claim by any person against the owner or operator for injuries or property damage, the renter must notify the owner immediately and confirm that notification in writing with full details as soon as practicable. The renter must comply with, and assist the owner to comply with, all requirements of the owner’s insurer relating to any such claim.</w:t>
       </w:r>
@@ -1847,32 +2172,45 @@
         <w:keepLines/>
         <w:spacing w:after="100" w:line="259" w:lineRule="auto"/>
         <w:ind w:left="-142" w:hanging="142"/>
+        <w:rPr>
+          <w:rFonts w:ascii="Arial" w:hAnsi="Arial" w:cs="Arial"/>
+          <w:sz w:val="18"/>
+          <w:szCs w:val="18"/>
+        </w:rPr>
       </w:pPr>
       <w:r>
         <w:rPr>
+          <w:rFonts w:ascii="Arial" w:hAnsi="Arial" w:cs="Arial"/>
           <w:b/>
           <w:color w:val="183A5A"/>
-          <w:sz w:val="19"/>
+          <w:sz w:val="18"/>
+          <w:szCs w:val="18"/>
         </w:rPr>
         <w:t xml:space="preserve">11. </w:t>
       </w:r>
       <w:r>
         <w:rPr>
-          <w:sz w:val="19"/>
+          <w:rFonts w:ascii="Arial" w:hAnsi="Arial" w:cs="Arial"/>
+          <w:sz w:val="18"/>
+          <w:szCs w:val="18"/>
         </w:rPr>
         <w:t xml:space="preserve">The renter must pay to the owner any total cost of recovery, cleaning, repair, or damage arising from </w:t>
       </w:r>
       <w:proofErr w:type="spellStart"/>
       <w:r>
         <w:rPr>
-          <w:sz w:val="19"/>
+          <w:rFonts w:ascii="Arial" w:hAnsi="Arial" w:cs="Arial"/>
+          <w:sz w:val="18"/>
+          <w:szCs w:val="18"/>
         </w:rPr>
         <w:t>wilful</w:t>
       </w:r>
       <w:proofErr w:type="spellEnd"/>
       <w:r>
         <w:rPr>
-          <w:sz w:val="19"/>
+          <w:rFonts w:ascii="Arial" w:hAnsi="Arial" w:cs="Arial"/>
+          <w:sz w:val="18"/>
+          <w:szCs w:val="18"/>
         </w:rPr>
         <w:t xml:space="preserve"> misuse of the equipment.</w:t>
       </w:r>
@@ -1882,18 +2220,27 @@
         <w:keepLines/>
         <w:spacing w:after="100" w:line="259" w:lineRule="auto"/>
         <w:ind w:left="-142" w:hanging="142"/>
+        <w:rPr>
+          <w:rFonts w:ascii="Arial" w:hAnsi="Arial" w:cs="Arial"/>
+          <w:sz w:val="18"/>
+          <w:szCs w:val="18"/>
+        </w:rPr>
       </w:pPr>
       <w:r>
         <w:rPr>
+          <w:rFonts w:ascii="Arial" w:hAnsi="Arial" w:cs="Arial"/>
           <w:b/>
           <w:color w:val="183A5A"/>
-          <w:sz w:val="19"/>
+          <w:sz w:val="18"/>
+          <w:szCs w:val="18"/>
         </w:rPr>
         <w:t xml:space="preserve">12. </w:t>
       </w:r>
       <w:r>
         <w:rPr>
-          <w:sz w:val="19"/>
+          <w:rFonts w:ascii="Arial" w:hAnsi="Arial" w:cs="Arial"/>
+          <w:sz w:val="18"/>
+          <w:szCs w:val="18"/>
         </w:rPr>
         <w:t>The renter must also pay any expenses, including legal expenses, incurred by the owner or its agent in repossessing, or attempting to repossess, the equipment, accessories, or outstanding monies.</w:t>
       </w:r>
@@ -1903,18 +2250,27 @@
         <w:keepLines/>
         <w:spacing w:after="100" w:line="259" w:lineRule="auto"/>
         <w:ind w:left="-142" w:hanging="142"/>
+        <w:rPr>
+          <w:rFonts w:ascii="Arial" w:hAnsi="Arial" w:cs="Arial"/>
+          <w:sz w:val="18"/>
+          <w:szCs w:val="18"/>
+        </w:rPr>
       </w:pPr>
       <w:r>
         <w:rPr>
+          <w:rFonts w:ascii="Arial" w:hAnsi="Arial" w:cs="Arial"/>
           <w:b/>
           <w:color w:val="183A5A"/>
-          <w:sz w:val="19"/>
+          <w:sz w:val="18"/>
+          <w:szCs w:val="18"/>
         </w:rPr>
         <w:t xml:space="preserve">13. </w:t>
       </w:r>
       <w:r>
         <w:rPr>
-          <w:sz w:val="19"/>
+          <w:rFonts w:ascii="Arial" w:hAnsi="Arial" w:cs="Arial"/>
+          <w:sz w:val="18"/>
+          <w:szCs w:val="18"/>
         </w:rPr>
         <w:t>The renter undertakes that the equipment will be returned to the owner at the place from which it was rented, in the same condition as received, no later than the nominated date and time. The late return fee is one-fifth of the daily rate per hour.</w:t>
       </w:r>
@@ -1924,18 +2280,27 @@
         <w:keepLines/>
         <w:spacing w:after="100" w:line="259" w:lineRule="auto"/>
         <w:ind w:left="-142" w:hanging="142"/>
+        <w:rPr>
+          <w:rFonts w:ascii="Arial" w:hAnsi="Arial" w:cs="Arial"/>
+          <w:sz w:val="18"/>
+          <w:szCs w:val="18"/>
+        </w:rPr>
       </w:pPr>
       <w:r>
         <w:rPr>
+          <w:rFonts w:ascii="Arial" w:hAnsi="Arial" w:cs="Arial"/>
           <w:b/>
           <w:color w:val="183A5A"/>
-          <w:sz w:val="19"/>
+          <w:sz w:val="18"/>
+          <w:szCs w:val="18"/>
         </w:rPr>
         <w:t xml:space="preserve">14. </w:t>
       </w:r>
       <w:r>
         <w:rPr>
-          <w:sz w:val="19"/>
+          <w:rFonts w:ascii="Arial" w:hAnsi="Arial" w:cs="Arial"/>
+          <w:sz w:val="18"/>
+          <w:szCs w:val="18"/>
         </w:rPr>
         <w:t>Loss of or damage to the equipment does not invalidate the lease agreement.</w:t>
       </w:r>
@@ -1945,18 +2310,27 @@
         <w:keepLines/>
         <w:spacing w:after="100" w:line="259" w:lineRule="auto"/>
         <w:ind w:left="-142" w:hanging="142"/>
+        <w:rPr>
+          <w:rFonts w:ascii="Arial" w:hAnsi="Arial" w:cs="Arial"/>
+          <w:sz w:val="18"/>
+          <w:szCs w:val="18"/>
+        </w:rPr>
       </w:pPr>
       <w:r>
         <w:rPr>
+          <w:rFonts w:ascii="Arial" w:hAnsi="Arial" w:cs="Arial"/>
           <w:b/>
           <w:color w:val="183A5A"/>
-          <w:sz w:val="19"/>
+          <w:sz w:val="18"/>
+          <w:szCs w:val="18"/>
         </w:rPr>
         <w:t xml:space="preserve">15. </w:t>
       </w:r>
       <w:r>
         <w:rPr>
-          <w:sz w:val="19"/>
+          <w:rFonts w:ascii="Arial" w:hAnsi="Arial" w:cs="Arial"/>
+          <w:sz w:val="18"/>
+          <w:szCs w:val="18"/>
         </w:rPr>
         <w:t>Any amount for which the renter is liable under this agreement may be deducted from the security bond by the owner. Any amount greater than the security bond remains recoverable from the renter, who is personally liable for that amount in addition to the security bond.</w:t>
       </w:r>
@@ -1966,18 +2340,27 @@
         <w:keepLines/>
         <w:spacing w:after="100" w:line="259" w:lineRule="auto"/>
         <w:ind w:left="-142" w:hanging="142"/>
+        <w:rPr>
+          <w:rFonts w:ascii="Arial" w:hAnsi="Arial" w:cs="Arial"/>
+          <w:sz w:val="18"/>
+          <w:szCs w:val="18"/>
+        </w:rPr>
       </w:pPr>
       <w:r>
         <w:rPr>
+          <w:rFonts w:ascii="Arial" w:hAnsi="Arial" w:cs="Arial"/>
           <w:b/>
           <w:color w:val="183A5A"/>
-          <w:sz w:val="19"/>
+          <w:sz w:val="18"/>
+          <w:szCs w:val="18"/>
         </w:rPr>
         <w:t xml:space="preserve">16. </w:t>
       </w:r>
       <w:r>
         <w:rPr>
-          <w:sz w:val="19"/>
+          <w:rFonts w:ascii="Arial" w:hAnsi="Arial" w:cs="Arial"/>
+          <w:sz w:val="18"/>
+          <w:szCs w:val="18"/>
         </w:rPr>
         <w:t>The renter must not allow the equipment to be repaired without the owner’s approval, create a lien over the equipment, or part with possession of the equipment.</w:t>
       </w:r>
@@ -1987,18 +2370,27 @@
         <w:keepLines/>
         <w:spacing w:after="100" w:line="259" w:lineRule="auto"/>
         <w:ind w:left="-142" w:hanging="142"/>
+        <w:rPr>
+          <w:rFonts w:ascii="Arial" w:hAnsi="Arial" w:cs="Arial"/>
+          <w:sz w:val="18"/>
+          <w:szCs w:val="18"/>
+        </w:rPr>
       </w:pPr>
       <w:r>
         <w:rPr>
+          <w:rFonts w:ascii="Arial" w:hAnsi="Arial" w:cs="Arial"/>
           <w:b/>
           <w:color w:val="183A5A"/>
-          <w:sz w:val="19"/>
+          <w:sz w:val="18"/>
+          <w:szCs w:val="18"/>
         </w:rPr>
         <w:t xml:space="preserve">17. </w:t>
       </w:r>
       <w:r>
         <w:rPr>
-          <w:sz w:val="19"/>
+          <w:rFonts w:ascii="Arial" w:hAnsi="Arial" w:cs="Arial"/>
+          <w:sz w:val="18"/>
+          <w:szCs w:val="18"/>
         </w:rPr>
         <w:t>Where there is more than one renter, each renter is jointly and severally liable for the amounts due under this agreement.</w:t>
       </w:r>
@@ -2008,18 +2400,27 @@
         <w:keepLines/>
         <w:spacing w:after="100" w:line="259" w:lineRule="auto"/>
         <w:ind w:left="-142" w:hanging="142"/>
+        <w:rPr>
+          <w:rFonts w:ascii="Arial" w:hAnsi="Arial" w:cs="Arial"/>
+          <w:sz w:val="18"/>
+          <w:szCs w:val="18"/>
+        </w:rPr>
       </w:pPr>
       <w:r>
         <w:rPr>
+          <w:rFonts w:ascii="Arial" w:hAnsi="Arial" w:cs="Arial"/>
           <w:b/>
           <w:color w:val="183A5A"/>
-          <w:sz w:val="19"/>
+          <w:sz w:val="18"/>
+          <w:szCs w:val="18"/>
         </w:rPr>
         <w:t xml:space="preserve">18. </w:t>
       </w:r>
       <w:r>
         <w:rPr>
-          <w:sz w:val="19"/>
+          <w:rFonts w:ascii="Arial" w:hAnsi="Arial" w:cs="Arial"/>
+          <w:sz w:val="18"/>
+          <w:szCs w:val="18"/>
         </w:rPr>
         <w:t>The owner is not liable for any loss or damage arising through breakdown, mechanical defect, accident, or any consequential loss or damage whatsoever.</w:t>
       </w:r>
@@ -2029,18 +2430,27 @@
         <w:keepLines/>
         <w:spacing w:after="100" w:line="259" w:lineRule="auto"/>
         <w:ind w:left="-142" w:hanging="142"/>
+        <w:rPr>
+          <w:rFonts w:ascii="Arial" w:hAnsi="Arial" w:cs="Arial"/>
+          <w:sz w:val="18"/>
+          <w:szCs w:val="18"/>
+        </w:rPr>
       </w:pPr>
       <w:r>
         <w:rPr>
+          <w:rFonts w:ascii="Arial" w:hAnsi="Arial" w:cs="Arial"/>
           <w:b/>
           <w:color w:val="183A5A"/>
-          <w:sz w:val="19"/>
+          <w:sz w:val="18"/>
+          <w:szCs w:val="18"/>
         </w:rPr>
         <w:t xml:space="preserve">19. </w:t>
       </w:r>
       <w:r>
         <w:rPr>
-          <w:sz w:val="19"/>
+          <w:rFonts w:ascii="Arial" w:hAnsi="Arial" w:cs="Arial"/>
+          <w:sz w:val="18"/>
+          <w:szCs w:val="18"/>
         </w:rPr>
         <w:t>The owner is not liable to any person whatsoever for any loss of or damage to property. The renter indemnifies the owner against any such claims.</w:t>
       </w:r>
@@ -2050,18 +2460,27 @@
         <w:keepLines/>
         <w:spacing w:after="100" w:line="259" w:lineRule="auto"/>
         <w:ind w:left="-142" w:hanging="142"/>
+        <w:rPr>
+          <w:rFonts w:ascii="Arial" w:hAnsi="Arial" w:cs="Arial"/>
+          <w:sz w:val="18"/>
+          <w:szCs w:val="18"/>
+        </w:rPr>
       </w:pPr>
       <w:r>
         <w:rPr>
+          <w:rFonts w:ascii="Arial" w:hAnsi="Arial" w:cs="Arial"/>
           <w:b/>
           <w:color w:val="183A5A"/>
-          <w:sz w:val="19"/>
+          <w:sz w:val="18"/>
+          <w:szCs w:val="18"/>
         </w:rPr>
         <w:t xml:space="preserve">20. </w:t>
       </w:r>
       <w:r>
         <w:rPr>
-          <w:sz w:val="19"/>
+          <w:rFonts w:ascii="Arial" w:hAnsi="Arial" w:cs="Arial"/>
+          <w:sz w:val="18"/>
+          <w:szCs w:val="18"/>
         </w:rPr>
         <w:t>Insurance for theft, damage, or accidental damage to the equipment is the responsibility of the renter.</w:t>
       </w:r>
@@ -2071,9 +2490,13 @@
         <w:keepLines/>
         <w:spacing w:after="100" w:line="259" w:lineRule="auto"/>
         <w:ind w:left="-142" w:hanging="142"/>
+        <w:rPr>
+          <w:rFonts w:ascii="Arial" w:hAnsi="Arial" w:cs="Arial"/>
+        </w:rPr>
       </w:pPr>
       <w:r>
         <w:rPr>
+          <w:rFonts w:ascii="Arial" w:hAnsi="Arial" w:cs="Arial"/>
           <w:b/>
           <w:color w:val="183A5A"/>
           <w:sz w:val="19"/>
@@ -2082,6 +2505,7 @@
       </w:r>
       <w:r>
         <w:rPr>
+          <w:rFonts w:ascii="Arial" w:hAnsi="Arial" w:cs="Arial"/>
           <w:sz w:val="19"/>
         </w:rPr>
         <w:t>The equipment is, and will at all times remain, the sole and exclusive property of the Lessor. The Lessee has no right, title, or interest in the equipment except as expressly set out in this lease. The agreement cannot be changed after it is signed.</w:t>
@@ -2171,7 +2595,23 @@
               <w:color w:val="6B7280"/>
               <w:sz w:val="17"/>
             </w:rPr>
-            <w:t>Engineering Surveys  |  Equipment Lease Agreement</w:t>
+            <w:t xml:space="preserve">Engineering </w:t>
+          </w:r>
+          <w:proofErr w:type="gramStart"/>
+          <w:r>
+            <w:rPr>
+              <w:color w:val="6B7280"/>
+              <w:sz w:val="17"/>
+            </w:rPr>
+            <w:t>Surveys  |</w:t>
+          </w:r>
+          <w:proofErr w:type="gramEnd"/>
+          <w:r>
+            <w:rPr>
+              <w:color w:val="6B7280"/>
+              <w:sz w:val="17"/>
+            </w:rPr>
+            <w:t xml:space="preserve">  Equipment Lease Agreement</w:t>
           </w:r>
         </w:p>
       </w:tc>
@@ -2277,7 +2717,23 @@
               <w:color w:val="6B7280"/>
               <w:sz w:val="17"/>
             </w:rPr>
-            <w:t>Engineering Surveys  |  Equipment Lease Agreement</w:t>
+            <w:t xml:space="preserve">Engineering </w:t>
+          </w:r>
+          <w:proofErr w:type="gramStart"/>
+          <w:r>
+            <w:rPr>
+              <w:color w:val="6B7280"/>
+              <w:sz w:val="17"/>
+            </w:rPr>
+            <w:t>Surveys  |</w:t>
+          </w:r>
+          <w:proofErr w:type="gramEnd"/>
+          <w:r>
+            <w:rPr>
+              <w:color w:val="6B7280"/>
+              <w:sz w:val="17"/>
+            </w:rPr>
+            <w:t xml:space="preserve">  Equipment Lease Agreement</w:t>
           </w:r>
         </w:p>
       </w:tc>
@@ -2507,7 +2963,35 @@
             <w:rPr>
               <w:sz w:val="17"/>
             </w:rPr>
-            <w:t>T: (08) 8340 4469  |  M: 0411 744 095  |  F: (08) 8340 4470</w:t>
+            <w:t xml:space="preserve">T: (08) 8340 </w:t>
+          </w:r>
+          <w:proofErr w:type="gramStart"/>
+          <w:r>
+            <w:rPr>
+              <w:sz w:val="17"/>
+            </w:rPr>
+            <w:t>4469  |</w:t>
+          </w:r>
+          <w:proofErr w:type="gramEnd"/>
+          <w:r>
+            <w:rPr>
+              <w:sz w:val="17"/>
+            </w:rPr>
+            <w:t xml:space="preserve">  M: 0411 744 </w:t>
+          </w:r>
+          <w:proofErr w:type="gramStart"/>
+          <w:r>
+            <w:rPr>
+              <w:sz w:val="17"/>
+            </w:rPr>
+            <w:t>095  |</w:t>
+          </w:r>
+          <w:proofErr w:type="gramEnd"/>
+          <w:r>
+            <w:rPr>
+              <w:sz w:val="17"/>
+            </w:rPr>
+            <w:t xml:space="preserve">  F: (08) 8340 4470</w:t>
           </w:r>
         </w:p>
         <w:p>
@@ -2518,7 +3002,21 @@
             <w:rPr>
               <w:sz w:val="17"/>
             </w:rPr>
-            <w:t>E: office@engsurveys.com.au  |  www.engsurveys.com.au</w:t>
+            <w:t xml:space="preserve">E: </w:t>
+          </w:r>
+          <w:proofErr w:type="gramStart"/>
+          <w:r>
+            <w:rPr>
+              <w:sz w:val="17"/>
+            </w:rPr>
+            <w:t>office@engsurveys.com.au  |</w:t>
+          </w:r>
+          <w:proofErr w:type="gramEnd"/>
+          <w:r>
+            <w:rPr>
+              <w:sz w:val="17"/>
+            </w:rPr>
+            <w:t xml:space="preserve">  www.engsurveys.com.au</w:t>
           </w:r>
         </w:p>
         <w:p>

</xml_diff>